<commit_message>
POO S12 (Colecciones): profundizacion rigurosa (framework, List, Set, Map, genericos, costos)
</commit_message>
<xml_diff>
--- a/12-week/optional-activity/pdf/Actividad-Semana12.docx
+++ b/12-week/optional-activity/pdf/Actividad-Semana12.docx
@@ -31,7 +31,7 @@
           <w:sz w:val="22"/>
           <w:szCs w:val="22"/>
         </w:rPr>
-        <w:t xml:space="preserve">Programación y Diseño Orientado a Objetos · Semana 12 · Gestión con colecciones</w:t>
+        <w:t xml:space="preserve">Programación y Diseño Orientado a Objetos · Semana 12 · Gestión de datos con colecciones</w:t>
       </w:r>
     </w:p>
     <w:tbl>
@@ -454,7 +454,7 @@
           <w:sz w:val="22"/>
           <w:szCs w:val="22"/>
         </w:rPr>
-        <w:t xml:space="preserve">Aplicar operaciones de agregar, buscar y recorrer.</w:t>
+        <w:t xml:space="preserve">Aplicar agregar, buscar por clave y recorrer.</w:t>
       </w:r>
     </w:p>
     <w:p>
@@ -478,7 +478,7 @@
           <w:sz w:val="22"/>
           <w:szCs w:val="22"/>
         </w:rPr>
-        <w:t xml:space="preserve">Elegir la colección según la operación dominante.</w:t>
+        <w:t xml:space="preserve">Justificar la elección de la colección.</w:t>
       </w:r>
     </w:p>
     <w:p>
@@ -539,7 +539,61 @@
           <w:sz w:val="22"/>
           <w:szCs w:val="22"/>
         </w:rPr>
-        <w:t xml:space="preserve"> (código, nombre, promedio).</w:t>
+        <w:t xml:space="preserve"> (código, nombre, promedio) con </w:t>
+      </w:r>
+      <w:r>
+        <w:rPr>
+          <w:rFonts w:ascii="Consolas" w:hAnsi="Consolas" w:cs="Consolas"/>
+          <w:color w:val="000000"/>
+          <w:sz w:val="22"/>
+          <w:szCs w:val="22"/>
+        </w:rPr>
+        <w:t xml:space="preserve">equals</w:t>
+      </w:r>
+      <w:r>
+        <w:rPr>
+          <w:rFonts w:ascii="Times New Roman" w:hAnsi="Times New Roman" w:cs="Times New Roman"/>
+          <w:color w:val="000000"/>
+          <w:sz w:val="22"/>
+          <w:szCs w:val="22"/>
+        </w:rPr>
+        <w:t xml:space="preserve">/</w:t>
+      </w:r>
+      <w:r>
+        <w:rPr>
+          <w:rFonts w:ascii="Consolas" w:hAnsi="Consolas" w:cs="Consolas"/>
+          <w:color w:val="000000"/>
+          <w:sz w:val="22"/>
+          <w:szCs w:val="22"/>
+        </w:rPr>
+        <w:t xml:space="preserve">hashCode</w:t>
+      </w:r>
+      <w:r>
+        <w:rPr>
+          <w:rFonts w:ascii="Times New Roman" w:hAnsi="Times New Roman" w:cs="Times New Roman"/>
+          <w:color w:val="000000"/>
+          <w:sz w:val="22"/>
+          <w:szCs w:val="22"/>
+        </w:rPr>
+        <w:t xml:space="preserve"> por </w:t>
+      </w:r>
+      <w:r>
+        <w:rPr>
+          <w:rFonts w:ascii="Consolas" w:hAnsi="Consolas" w:cs="Consolas"/>
+          <w:color w:val="000000"/>
+          <w:sz w:val="22"/>
+          <w:szCs w:val="22"/>
+        </w:rPr>
+        <w:t xml:space="preserve">codigo</w:t>
+      </w:r>
+      <w:r>
+        <w:rPr>
+          <w:rFonts w:ascii="Times New Roman" w:hAnsi="Times New Roman" w:cs="Times New Roman"/>
+          <w:color w:val="000000"/>
+          <w:sz w:val="22"/>
+          <w:szCs w:val="22"/>
+        </w:rPr>
+        <w:t xml:space="preserve">.</w:t>
       </w:r>
     </w:p>
     <w:p>
@@ -605,7 +659,45 @@
           <w:sz w:val="22"/>
           <w:szCs w:val="22"/>
         </w:rPr>
-        <w:t xml:space="preserve">Implementa: agregar, buscar por código, listar todos y calcular el promedio general.</w:t>
+        <w:t xml:space="preserve">Implementa: agregar, </w:t>
+      </w:r>
+      <w:r>
+        <w:rPr>
+          <w:rFonts w:ascii="Times New Roman" w:hAnsi="Times New Roman" w:cs="Times New Roman"/>
+          <w:b/>
+          <w:color w:val="000000"/>
+          <w:sz w:val="22"/>
+          <w:szCs w:val="22"/>
+        </w:rPr>
+        <w:t xml:space="preserve">buscar por código</w:t>
+      </w:r>
+      <w:r>
+        <w:rPr>
+          <w:rFonts w:ascii="Times New Roman" w:hAnsi="Times New Roman" w:cs="Times New Roman"/>
+          <w:color w:val="000000"/>
+          <w:sz w:val="22"/>
+          <w:szCs w:val="22"/>
+        </w:rPr>
+        <w:t xml:space="preserve">, listar todos y calcular el </w:t>
+      </w:r>
+      <w:r>
+        <w:rPr>
+          <w:rFonts w:ascii="Times New Roman" w:hAnsi="Times New Roman" w:cs="Times New Roman"/>
+          <w:b/>
+          <w:color w:val="000000"/>
+          <w:sz w:val="22"/>
+          <w:szCs w:val="22"/>
+        </w:rPr>
+        <w:t xml:space="preserve">promedio general</w:t>
+      </w:r>
+      <w:r>
+        <w:rPr>
+          <w:rFonts w:ascii="Times New Roman" w:hAnsi="Times New Roman" w:cs="Times New Roman"/>
+          <w:color w:val="000000"/>
+          <w:sz w:val="22"/>
+          <w:szCs w:val="22"/>
+        </w:rPr>
+        <w:t xml:space="preserve">.</w:t>
       </w:r>
     </w:p>
     <w:p>
@@ -629,7 +721,122 @@
           <w:sz w:val="22"/>
           <w:szCs w:val="22"/>
         </w:rPr>
-        <w:t xml:space="preserve">En el README, explica por qué usaste un Map (búsqueda por código) en lugar de una List.</w:t>
+        <w:t xml:space="preserve">Usa un </w:t>
+      </w:r>
+      <w:r>
+        <w:rPr>
+          <w:rFonts w:ascii="Consolas" w:hAnsi="Consolas" w:cs="Consolas"/>
+          <w:color w:val="000000"/>
+          <w:sz w:val="22"/>
+          <w:szCs w:val="22"/>
+        </w:rPr>
+        <w:t xml:space="preserve">Set&lt;String&gt;</w:t>
+      </w:r>
+      <w:r>
+        <w:rPr>
+          <w:rFonts w:ascii="Times New Roman" w:hAnsi="Times New Roman" w:cs="Times New Roman"/>
+          <w:color w:val="000000"/>
+          <w:sz w:val="22"/>
+          <w:szCs w:val="22"/>
+        </w:rPr>
+        <w:t xml:space="preserve"> para registrar los códigos de estudiantes en “lista de honor” (promedio ≥ 4.5), sin duplicados.</w:t>
+      </w:r>
+    </w:p>
+    <w:p>
+      <w:pPr>
+        <w:spacing w:after="120" w:line="276" w:lineRule="auto"/>
+        <w:ind w:left="454" w:hanging="284"/>
+      </w:pPr>
+      <w:r>
+        <w:rPr>
+          <w:rFonts w:ascii="Times New Roman" w:hAnsi="Times New Roman" w:cs="Times New Roman"/>
+          <w:color w:val="000000"/>
+          <w:sz w:val="22"/>
+          <w:szCs w:val="22"/>
+        </w:rPr>
+        <w:t xml:space="preserve">5.	</w:t>
+      </w:r>
+      <w:r>
+        <w:rPr>
+          <w:rFonts w:ascii="Times New Roman" w:hAnsi="Times New Roman" w:cs="Times New Roman"/>
+          <w:color w:val="000000"/>
+          <w:sz w:val="22"/>
+          <w:szCs w:val="22"/>
+        </w:rPr>
+        <w:t xml:space="preserve">En el README, explica </w:t>
+      </w:r>
+      <w:r>
+        <w:rPr>
+          <w:rFonts w:ascii="Times New Roman" w:hAnsi="Times New Roman" w:cs="Times New Roman"/>
+          <w:b/>
+          <w:color w:val="000000"/>
+          <w:sz w:val="22"/>
+          <w:szCs w:val="22"/>
+        </w:rPr>
+        <w:t xml:space="preserve">por qué</w:t>
+      </w:r>
+      <w:r>
+        <w:rPr>
+          <w:rFonts w:ascii="Times New Roman" w:hAnsi="Times New Roman" w:cs="Times New Roman"/>
+          <w:color w:val="000000"/>
+          <w:sz w:val="22"/>
+          <w:szCs w:val="22"/>
+        </w:rPr>
+        <w:t xml:space="preserve"> usaste </w:t>
+      </w:r>
+      <w:r>
+        <w:rPr>
+          <w:rFonts w:ascii="Consolas" w:hAnsi="Consolas" w:cs="Consolas"/>
+          <w:color w:val="000000"/>
+          <w:sz w:val="22"/>
+          <w:szCs w:val="22"/>
+        </w:rPr>
+        <w:t xml:space="preserve">Map</w:t>
+      </w:r>
+      <w:r>
+        <w:rPr>
+          <w:rFonts w:ascii="Times New Roman" w:hAnsi="Times New Roman" w:cs="Times New Roman"/>
+          <w:color w:val="000000"/>
+          <w:sz w:val="22"/>
+          <w:szCs w:val="22"/>
+        </w:rPr>
+        <w:t xml:space="preserve"> (búsqueda por código) en lugar de </w:t>
+      </w:r>
+      <w:r>
+        <w:rPr>
+          <w:rFonts w:ascii="Consolas" w:hAnsi="Consolas" w:cs="Consolas"/>
+          <w:color w:val="000000"/>
+          <w:sz w:val="22"/>
+          <w:szCs w:val="22"/>
+        </w:rPr>
+        <w:t xml:space="preserve">List</w:t>
+      </w:r>
+      <w:r>
+        <w:rPr>
+          <w:rFonts w:ascii="Times New Roman" w:hAnsi="Times New Roman" w:cs="Times New Roman"/>
+          <w:color w:val="000000"/>
+          <w:sz w:val="22"/>
+          <w:szCs w:val="22"/>
+        </w:rPr>
+        <w:t xml:space="preserve">, y por qué </w:t>
+      </w:r>
+      <w:r>
+        <w:rPr>
+          <w:rFonts w:ascii="Consolas" w:hAnsi="Consolas" w:cs="Consolas"/>
+          <w:color w:val="000000"/>
+          <w:sz w:val="22"/>
+          <w:szCs w:val="22"/>
+        </w:rPr>
+        <w:t xml:space="preserve">Set</w:t>
+      </w:r>
+      <w:r>
+        <w:rPr>
+          <w:rFonts w:ascii="Times New Roman" w:hAnsi="Times New Roman" w:cs="Times New Roman"/>
+          <w:color w:val="000000"/>
+          <w:sz w:val="22"/>
+          <w:szCs w:val="22"/>
+        </w:rPr>
+        <w:t xml:space="preserve"> para la lista de honor.</w:t>
       </w:r>
     </w:p>
     <w:p>
@@ -672,7 +879,7 @@
           <w:sz w:val="22"/>
           <w:szCs w:val="22"/>
         </w:rPr>
-        <w:t xml:space="preserve">Uso de </w:t>
+        <w:t xml:space="preserve">Uso correcto de </w:t>
       </w:r>
       <w:r>
         <w:rPr>
@@ -690,6 +897,24 @@
           <w:sz w:val="22"/>
           <w:szCs w:val="22"/>
         </w:rPr>
+        <w:t xml:space="preserve"> y </w:t>
+      </w:r>
+      <w:r>
+        <w:rPr>
+          <w:rFonts w:ascii="Consolas" w:hAnsi="Consolas" w:cs="Consolas"/>
+          <w:color w:val="000000"/>
+          <w:sz w:val="22"/>
+          <w:szCs w:val="22"/>
+        </w:rPr>
+        <w:t xml:space="preserve">Set</w:t>
+      </w:r>
+      <w:r>
+        <w:rPr>
+          <w:rFonts w:ascii="Times New Roman" w:hAnsi="Times New Roman" w:cs="Times New Roman"/>
+          <w:color w:val="000000"/>
+          <w:sz w:val="22"/>
+          <w:szCs w:val="22"/>
+        </w:rPr>
         <w:t xml:space="preserve"> (y </w:t>
       </w:r>
       <w:r>
@@ -708,7 +933,7 @@
           <w:sz w:val="22"/>
           <w:szCs w:val="22"/>
         </w:rPr>
-        <w:t xml:space="preserve"> si lo necesitas).</w:t>
+        <w:t xml:space="preserve"> si aplica).</w:t>
       </w:r>
     </w:p>
     <w:p>
@@ -727,12 +952,57 @@
       </w:r>
       <w:r>
         <w:rPr>
-          <w:rFonts w:ascii="Times New Roman" w:hAnsi="Times New Roman" w:cs="Times New Roman"/>
-          <w:color w:val="000000"/>
-          <w:sz w:val="22"/>
-          <w:szCs w:val="22"/>
-        </w:rPr>
-        <w:t xml:space="preserve">Búsqueda por clave y recorrido.</w:t>
+          <w:rFonts w:ascii="Consolas" w:hAnsi="Consolas" w:cs="Consolas"/>
+          <w:color w:val="000000"/>
+          <w:sz w:val="22"/>
+          <w:szCs w:val="22"/>
+        </w:rPr>
+        <w:t xml:space="preserve">equals</w:t>
+      </w:r>
+      <w:r>
+        <w:rPr>
+          <w:rFonts w:ascii="Times New Roman" w:hAnsi="Times New Roman" w:cs="Times New Roman"/>
+          <w:color w:val="000000"/>
+          <w:sz w:val="22"/>
+          <w:szCs w:val="22"/>
+        </w:rPr>
+        <w:t xml:space="preserve">/</w:t>
+      </w:r>
+      <w:r>
+        <w:rPr>
+          <w:rFonts w:ascii="Consolas" w:hAnsi="Consolas" w:cs="Consolas"/>
+          <w:color w:val="000000"/>
+          <w:sz w:val="22"/>
+          <w:szCs w:val="22"/>
+        </w:rPr>
+        <w:t xml:space="preserve">hashCode</w:t>
+      </w:r>
+      <w:r>
+        <w:rPr>
+          <w:rFonts w:ascii="Times New Roman" w:hAnsi="Times New Roman" w:cs="Times New Roman"/>
+          <w:color w:val="000000"/>
+          <w:sz w:val="22"/>
+          <w:szCs w:val="22"/>
+        </w:rPr>
+        <w:t xml:space="preserve"> coherentes en </w:t>
+      </w:r>
+      <w:r>
+        <w:rPr>
+          <w:rFonts w:ascii="Consolas" w:hAnsi="Consolas" w:cs="Consolas"/>
+          <w:color w:val="000000"/>
+          <w:sz w:val="22"/>
+          <w:szCs w:val="22"/>
+        </w:rPr>
+        <w:t xml:space="preserve">Estudiante</w:t>
+      </w:r>
+      <w:r>
+        <w:rPr>
+          <w:rFonts w:ascii="Times New Roman" w:hAnsi="Times New Roman" w:cs="Times New Roman"/>
+          <w:color w:val="000000"/>
+          <w:sz w:val="22"/>
+          <w:szCs w:val="22"/>
+        </w:rPr>
+        <w:t xml:space="preserve">.</w:t>
       </w:r>
     </w:p>
     <w:p>
@@ -756,7 +1026,31 @@
           <w:sz w:val="22"/>
           <w:szCs w:val="22"/>
         </w:rPr>
-        <w:t xml:space="preserve">Justificación de la colección elegida.</w:t>
+        <w:t xml:space="preserve">Búsqueda por clave y recorrido.</w:t>
+      </w:r>
+    </w:p>
+    <w:p>
+      <w:pPr>
+        <w:spacing w:after="120" w:line="276" w:lineRule="auto"/>
+        <w:ind w:left="454" w:hanging="284"/>
+      </w:pPr>
+      <w:r>
+        <w:rPr>
+          <w:rFonts w:ascii="Times New Roman" w:hAnsi="Times New Roman" w:cs="Times New Roman"/>
+          <w:color w:val="000000"/>
+          <w:sz w:val="22"/>
+          <w:szCs w:val="22"/>
+        </w:rPr>
+        <w:t xml:space="preserve">•	</w:t>
+      </w:r>
+      <w:r>
+        <w:rPr>
+          <w:rFonts w:ascii="Times New Roman" w:hAnsi="Times New Roman" w:cs="Times New Roman"/>
+          <w:color w:val="000000"/>
+          <w:sz w:val="22"/>
+          <w:szCs w:val="22"/>
+        </w:rPr>
+        <w:t xml:space="preserve">Justificación de las colecciones elegidas.</w:t>
       </w:r>
     </w:p>
     <w:p>
@@ -859,7 +1153,7 @@
           <w:sz w:val="18"/>
           <w:szCs w:val="18"/>
         </w:rPr>
-        <w:t xml:space="preserve">  README.md   -&gt; justificacion + salida</w:t>
+        <w:t xml:space="preserve">  README.md   -&gt; justificacion de colecciones + salida</w:t>
       </w:r>
     </w:p>
     <w:p>
@@ -899,7 +1193,7 @@
           <w:sz w:val="22"/>
           <w:szCs w:val="22"/>
         </w:rPr>
-        <w:t xml:space="preserve">Crea el repo público con ese nombre.</w:t>
+        <w:t xml:space="preserve">Crea el repositorio público con ese nombre.</w:t>
       </w:r>
     </w:p>
     <w:p>
@@ -947,7 +1241,7 @@
           <w:sz w:val="22"/>
           <w:szCs w:val="22"/>
         </w:rPr>
-        <w:t xml:space="preserve">Comparte el enlace por el canal indicado.</w:t>
+        <w:t xml:space="preserve">Comparte el enlace por el canal indicado por el docente.</w:t>
       </w:r>
     </w:p>
     <w:p>
@@ -1030,7 +1324,7 @@
                 <w:sz w:val="20"/>
                 <w:szCs w:val="20"/>
               </w:rPr>
-              <w:t xml:space="preserve">Excelente</w:t>
+              <w:t xml:space="preserve">Excelente (100%)</w:t>
             </w:r>
           </w:p>
         </w:tc>
@@ -1052,7 +1346,7 @@
                 <w:sz w:val="20"/>
                 <w:szCs w:val="20"/>
               </w:rPr>
-              <w:t xml:space="preserve">Aceptable</w:t>
+              <w:t xml:space="preserve">Aceptable (60%)</w:t>
             </w:r>
           </w:p>
         </w:tc>
@@ -1074,7 +1368,7 @@
                 <w:sz w:val="20"/>
                 <w:szCs w:val="20"/>
               </w:rPr>
-              <w:t xml:space="preserve">Por mejorar</w:t>
+              <w:t xml:space="preserve">Por mejorar (0%)</w:t>
             </w:r>
           </w:p>
         </w:tc>
@@ -1198,7 +1492,7 @@
                 <w:sz w:val="20"/>
                 <w:szCs w:val="20"/>
               </w:rPr>
-              <w:t xml:space="preserve">35</w:t>
+              <w:t xml:space="preserve">30</w:t>
             </w:r>
           </w:p>
         </w:tc>
@@ -1220,7 +1514,7 @@
                 <w:sz w:val="20"/>
                 <w:szCs w:val="20"/>
               </w:rPr>
-              <w:t xml:space="preserve">Operaciones (agregar/buscar/listar)</w:t>
+              <w:t xml:space="preserve">Uso de Set (lista de honor)</w:t>
             </w:r>
           </w:p>
         </w:tc>
@@ -1240,7 +1534,7 @@
                 <w:sz w:val="20"/>
                 <w:szCs w:val="20"/>
               </w:rPr>
-              <w:t xml:space="preserve">Todas</w:t>
+              <w:t xml:space="preserve">Correcto (sin duplicados)</w:t>
             </w:r>
           </w:p>
         </w:tc>
@@ -1260,7 +1554,7 @@
                 <w:sz w:val="20"/>
                 <w:szCs w:val="20"/>
               </w:rPr>
-              <w:t xml:space="preserve">Algunas</w:t>
+              <w:t xml:space="preserve">Parcial</w:t>
             </w:r>
           </w:p>
         </w:tc>
@@ -1280,7 +1574,7 @@
                 <w:sz w:val="20"/>
                 <w:szCs w:val="20"/>
               </w:rPr>
-              <w:t xml:space="preserve">Fallan</w:t>
+              <w:t xml:space="preserve">Ausente</w:t>
             </w:r>
           </w:p>
         </w:tc>
@@ -1300,7 +1594,7 @@
                 <w:sz w:val="20"/>
                 <w:szCs w:val="20"/>
               </w:rPr>
-              <w:t xml:space="preserve">30</w:t>
+              <w:t xml:space="preserve">20</w:t>
             </w:r>
           </w:p>
         </w:tc>
@@ -1322,7 +1616,7 @@
                 <w:sz w:val="20"/>
                 <w:szCs w:val="20"/>
               </w:rPr>
-              <w:t xml:space="preserve">Justificación de la colección</w:t>
+              <w:t xml:space="preserve">equals/hashCode por codigo</w:t>
             </w:r>
           </w:p>
         </w:tc>
@@ -1342,7 +1636,7 @@
                 <w:sz w:val="20"/>
                 <w:szCs w:val="20"/>
               </w:rPr>
-              <w:t xml:space="preserve">Clara</w:t>
+              <w:t xml:space="preserve">Coherentes</w:t>
             </w:r>
           </w:p>
         </w:tc>
@@ -1362,7 +1656,7 @@
                 <w:sz w:val="20"/>
                 <w:szCs w:val="20"/>
               </w:rPr>
-              <w:t xml:space="preserve">Básica</w:t>
+              <w:t xml:space="preserve">Uno</w:t>
             </w:r>
           </w:p>
         </w:tc>
@@ -1382,7 +1676,7 @@
                 <w:sz w:val="20"/>
                 <w:szCs w:val="20"/>
               </w:rPr>
-              <w:t xml:space="preserve">Ausente</w:t>
+              <w:t xml:space="preserve">Incorrectos</w:t>
             </w:r>
           </w:p>
         </w:tc>
@@ -1424,7 +1718,7 @@
                 <w:sz w:val="20"/>
                 <w:szCs w:val="20"/>
               </w:rPr>
-              <w:t xml:space="preserve">README y repositorio</w:t>
+              <w:t xml:space="preserve">Operaciones + justificación (README)</w:t>
             </w:r>
           </w:p>
         </w:tc>
@@ -1444,7 +1738,7 @@
                 <w:sz w:val="20"/>
                 <w:szCs w:val="20"/>
               </w:rPr>
-              <w:t xml:space="preserve">Ordenado</w:t>
+              <w:t xml:space="preserve">Completas y claras</w:t>
             </w:r>
           </w:p>
         </w:tc>
@@ -1464,7 +1758,7 @@
                 <w:sz w:val="20"/>
                 <w:szCs w:val="20"/>
               </w:rPr>
-              <w:t xml:space="preserve">Aceptable</w:t>
+              <w:t xml:space="preserve">Aceptables</w:t>
             </w:r>
           </w:p>
         </w:tc>
@@ -1484,7 +1778,7 @@
                 <w:sz w:val="20"/>
                 <w:szCs w:val="20"/>
               </w:rPr>
-              <w:t xml:space="preserve">Deficiente</w:t>
+              <w:t xml:space="preserve">Deficientes</w:t>
             </w:r>
           </w:p>
         </w:tc>
@@ -1504,7 +1798,7 @@
                 <w:sz w:val="20"/>
                 <w:szCs w:val="20"/>
               </w:rPr>
-              <w:t xml:space="preserve">15</w:t>
+              <w:t xml:space="preserve">30</w:t>
             </w:r>
           </w:p>
         </w:tc>
@@ -1523,7 +1817,7 @@
           <w:sz w:val="21"/>
           <w:szCs w:val="21"/>
         </w:rPr>
-        <w:t xml:space="preserve">Nota: actividad formativa y opcional (sin nota en Moodle). La guía unificada de entrega estará en el Manual de Entrega de Actividades Opcionales (próximamente).</w:t>
+        <w:t xml:space="preserve">Nota: actividad formativa y opcional (sin nota en Moodle). La guía unificada para entregar todas las actividades opcionales, válida para todas las materias, estará en el Manual de Entrega de Actividades Opcionales (próximamente).</w:t>
       </w:r>
     </w:p>
     <w:sectPr>

</xml_diff>